<commit_message>
Report TD3 partie ChatGPT
</commit_message>
<xml_diff>
--- a/report/td3.docx
+++ b/report/td3.docx
@@ -380,6 +380,616 @@
           <w:lang w:val="fr-FR"/>
         </w:rPr>
         <w:t>Nous remarquons que l’on obtient bien notre plafond. Mais surtout, on observe une diminution très conséquente de notre loss. C’est très bon signe, cela signifie que notre modèle a mieux généralisé notre problème.</w:t>
+      </w:r>
+    </w:p>
+    <w:p>
+      <w:pPr>
+        <w:jc w:val="center"/>
+        <w:rPr>
+          <w:b/>
+          <w:bCs/>
+          <w:lang w:val="fr-FR"/>
+        </w:rPr>
+      </w:pPr>
+      <w:r>
+        <w:rPr>
+          <w:b/>
+          <w:bCs/>
+          <w:lang w:val="fr-FR"/>
+        </w:rPr>
+        <w:t>ChatGpt</w:t>
+      </w:r>
+    </w:p>
+    <w:p>
+      <w:pPr>
+        <w:jc w:val="center"/>
+        <w:rPr>
+          <w:lang w:val="fr-FR"/>
+        </w:rPr>
+      </w:pPr>
+      <w:hyperlink r:id="rId8" w:history="1">
+        <w:r>
+          <w:rPr>
+            <w:rStyle w:val="Lienhypertexte"/>
+            <w:lang w:val="fr-FR"/>
+          </w:rPr>
+          <w:t>https://chat.openai.com/share/9355e4a0-7a93-4ac0-acae-58c8020bc075</w:t>
+        </w:r>
+      </w:hyperlink>
+    </w:p>
+    <w:p>
+      <w:pPr>
+        <w:rPr>
+          <w:noProof/>
+          <w:lang w:val="fr-FR"/>
+        </w:rPr>
+      </w:pPr>
+      <w:r>
+        <w:rPr>
+          <w:lang w:val="fr-FR"/>
+        </w:rPr>
+        <w:lastRenderedPageBreak/>
+        <w:t>On commence par donner du contexte. On essaie de tourner ça comme un jeu afin de donner automatiquement un feedback rapide et facile.</w:t>
+      </w:r>
+      <w:r>
+        <w:rPr>
+          <w:lang w:val="fr-FR"/>
+        </w:rPr>
+        <w:br/>
+      </w:r>
+      <w:r>
+        <w:rPr>
+          <w:noProof/>
+        </w:rPr>
+        <w:drawing>
+          <wp:inline distT="0" distB="0" distL="0" distR="0" wp14:anchorId="096C000E" wp14:editId="0F4ACC0A">
+            <wp:extent cx="5943600" cy="3403600"/>
+            <wp:effectExtent l="0" t="0" r="0" b="6350"/>
+            <wp:docPr id="1487416273" name="Image 1" descr="Une image contenant texte, capture d’écran, Police&#10;&#10;Description générée automatiquement"/>
+            <wp:cNvGraphicFramePr>
+              <a:graphicFrameLocks xmlns:a="http://schemas.openxmlformats.org/drawingml/2006/main" noChangeAspect="1"/>
+            </wp:cNvGraphicFramePr>
+            <a:graphic xmlns:a="http://schemas.openxmlformats.org/drawingml/2006/main">
+              <a:graphicData uri="http://schemas.openxmlformats.org/drawingml/2006/picture">
+                <pic:pic xmlns:pic="http://schemas.openxmlformats.org/drawingml/2006/picture">
+                  <pic:nvPicPr>
+                    <pic:cNvPr id="1487416273" name="Image 1" descr="Une image contenant texte, capture d’écran, Police&#10;&#10;Description générée automatiquement"/>
+                    <pic:cNvPicPr/>
+                  </pic:nvPicPr>
+                  <pic:blipFill>
+                    <a:blip r:embed="rId9"/>
+                    <a:stretch>
+                      <a:fillRect/>
+                    </a:stretch>
+                  </pic:blipFill>
+                  <pic:spPr>
+                    <a:xfrm>
+                      <a:off x="0" y="0"/>
+                      <a:ext cx="5943600" cy="3403600"/>
+                    </a:xfrm>
+                    <a:prstGeom prst="rect">
+                      <a:avLst/>
+                    </a:prstGeom>
+                  </pic:spPr>
+                </pic:pic>
+              </a:graphicData>
+            </a:graphic>
+          </wp:inline>
+        </w:drawing>
+      </w:r>
+      <w:r>
+        <w:rPr>
+          <w:noProof/>
+          <w:lang w:val="fr-FR"/>
+        </w:rPr>
+        <w:t xml:space="preserve"> </w:t>
+      </w:r>
+    </w:p>
+    <w:p>
+      <w:pPr>
+        <w:rPr>
+          <w:noProof/>
+          <w:lang w:val="fr-FR"/>
+        </w:rPr>
+      </w:pPr>
+    </w:p>
+    <w:p>
+      <w:pPr>
+        <w:rPr>
+          <w:noProof/>
+          <w:lang w:val="fr-FR"/>
+        </w:rPr>
+      </w:pPr>
+      <w:r>
+        <w:rPr>
+          <w:noProof/>
+          <w:lang w:val="fr-FR"/>
+        </w:rPr>
+        <w:t>ChatGPT a un peu du mal à savoir si c’est comique quand le titre n’est pas clairement sarcastique. On va essayer de contourner un peu les sécurités et le forcer à chercher dans sa base de données pour qu’il puisse trouver une information supplémentaire sur le nom qu’il détecte.</w:t>
+      </w:r>
+    </w:p>
+    <w:p>
+      <w:pPr>
+        <w:rPr>
+          <w:lang w:val="fr-FR"/>
+        </w:rPr>
+      </w:pPr>
+      <w:r>
+        <w:rPr>
+          <w:noProof/>
+        </w:rPr>
+        <w:lastRenderedPageBreak/>
+        <w:drawing>
+          <wp:inline distT="0" distB="0" distL="0" distR="0" wp14:anchorId="57AA169D" wp14:editId="25F3912F">
+            <wp:extent cx="5943600" cy="3926840"/>
+            <wp:effectExtent l="0" t="0" r="0" b="0"/>
+            <wp:docPr id="2117775547" name="Image 1" descr="Une image contenant texte, capture d’écran, Police&#10;&#10;Description générée automatiquement"/>
+            <wp:cNvGraphicFramePr>
+              <a:graphicFrameLocks xmlns:a="http://schemas.openxmlformats.org/drawingml/2006/main" noChangeAspect="1"/>
+            </wp:cNvGraphicFramePr>
+            <a:graphic xmlns:a="http://schemas.openxmlformats.org/drawingml/2006/main">
+              <a:graphicData uri="http://schemas.openxmlformats.org/drawingml/2006/picture">
+                <pic:pic xmlns:pic="http://schemas.openxmlformats.org/drawingml/2006/picture">
+                  <pic:nvPicPr>
+                    <pic:cNvPr id="2117775547" name="Image 1" descr="Une image contenant texte, capture d’écran, Police&#10;&#10;Description générée automatiquement"/>
+                    <pic:cNvPicPr/>
+                  </pic:nvPicPr>
+                  <pic:blipFill>
+                    <a:blip r:embed="rId10"/>
+                    <a:stretch>
+                      <a:fillRect/>
+                    </a:stretch>
+                  </pic:blipFill>
+                  <pic:spPr>
+                    <a:xfrm>
+                      <a:off x="0" y="0"/>
+                      <a:ext cx="5943600" cy="3926840"/>
+                    </a:xfrm>
+                    <a:prstGeom prst="rect">
+                      <a:avLst/>
+                    </a:prstGeom>
+                  </pic:spPr>
+                </pic:pic>
+              </a:graphicData>
+            </a:graphic>
+          </wp:inline>
+        </w:drawing>
+      </w:r>
+    </w:p>
+    <w:p>
+      <w:pPr>
+        <w:rPr>
+          <w:lang w:val="fr-FR"/>
+        </w:rPr>
+      </w:pPr>
+      <w:r>
+        <w:rPr>
+          <w:lang w:val="fr-FR"/>
+        </w:rPr>
+        <w:t>ChatGpt semble bien comprendre ce qu’il faut faire maintenant.</w:t>
+      </w:r>
+      <w:r>
+        <w:rPr>
+          <w:lang w:val="fr-FR"/>
+        </w:rPr>
+        <w:t xml:space="preserve"> Nous précisons désormais qu’il peut y avoir plusieurs noms voir aucun. On voudra désormais que les réponses soient présentées d’une façon particulière afin de traiter automatiquement les réponses.</w:t>
+      </w:r>
+      <w:r>
+        <w:rPr>
+          <w:lang w:val="fr-FR"/>
+        </w:rPr>
+        <w:br/>
+      </w:r>
+      <w:r>
+        <w:rPr>
+          <w:noProof/>
+        </w:rPr>
+        <w:drawing>
+          <wp:inline distT="0" distB="0" distL="0" distR="0" wp14:anchorId="1908863E" wp14:editId="3EAAE337">
+            <wp:extent cx="5943600" cy="3352165"/>
+            <wp:effectExtent l="0" t="0" r="0" b="635"/>
+            <wp:docPr id="935979468" name="Image 1" descr="Une image contenant texte, capture d’écran, Police&#10;&#10;Description générée automatiquement"/>
+            <wp:cNvGraphicFramePr>
+              <a:graphicFrameLocks xmlns:a="http://schemas.openxmlformats.org/drawingml/2006/main" noChangeAspect="1"/>
+            </wp:cNvGraphicFramePr>
+            <a:graphic xmlns:a="http://schemas.openxmlformats.org/drawingml/2006/main">
+              <a:graphicData uri="http://schemas.openxmlformats.org/drawingml/2006/picture">
+                <pic:pic xmlns:pic="http://schemas.openxmlformats.org/drawingml/2006/picture">
+                  <pic:nvPicPr>
+                    <pic:cNvPr id="935979468" name="Image 1" descr="Une image contenant texte, capture d’écran, Police&#10;&#10;Description générée automatiquement"/>
+                    <pic:cNvPicPr/>
+                  </pic:nvPicPr>
+                  <pic:blipFill>
+                    <a:blip r:embed="rId11"/>
+                    <a:stretch>
+                      <a:fillRect/>
+                    </a:stretch>
+                  </pic:blipFill>
+                  <pic:spPr>
+                    <a:xfrm>
+                      <a:off x="0" y="0"/>
+                      <a:ext cx="5943600" cy="3352165"/>
+                    </a:xfrm>
+                    <a:prstGeom prst="rect">
+                      <a:avLst/>
+                    </a:prstGeom>
+                  </pic:spPr>
+                </pic:pic>
+              </a:graphicData>
+            </a:graphic>
+          </wp:inline>
+        </w:drawing>
+      </w:r>
+    </w:p>
+    <w:p>
+      <w:pPr>
+        <w:rPr>
+          <w:lang w:val="fr-FR"/>
+        </w:rPr>
+      </w:pPr>
+      <w:r>
+        <w:rPr>
+          <w:noProof/>
+        </w:rPr>
+        <w:lastRenderedPageBreak/>
+        <w:drawing>
+          <wp:inline distT="0" distB="0" distL="0" distR="0" wp14:anchorId="2DB65745" wp14:editId="3C988F6D">
+            <wp:extent cx="5943600" cy="2561590"/>
+            <wp:effectExtent l="0" t="0" r="0" b="0"/>
+            <wp:docPr id="568389775" name="Image 1" descr="Une image contenant texte, capture d’écran, Police&#10;&#10;Description générée automatiquement"/>
+            <wp:cNvGraphicFramePr>
+              <a:graphicFrameLocks xmlns:a="http://schemas.openxmlformats.org/drawingml/2006/main" noChangeAspect="1"/>
+            </wp:cNvGraphicFramePr>
+            <a:graphic xmlns:a="http://schemas.openxmlformats.org/drawingml/2006/main">
+              <a:graphicData uri="http://schemas.openxmlformats.org/drawingml/2006/picture">
+                <pic:pic xmlns:pic="http://schemas.openxmlformats.org/drawingml/2006/picture">
+                  <pic:nvPicPr>
+                    <pic:cNvPr id="568389775" name="Image 1" descr="Une image contenant texte, capture d’écran, Police&#10;&#10;Description générée automatiquement"/>
+                    <pic:cNvPicPr/>
+                  </pic:nvPicPr>
+                  <pic:blipFill>
+                    <a:blip r:embed="rId12"/>
+                    <a:stretch>
+                      <a:fillRect/>
+                    </a:stretch>
+                  </pic:blipFill>
+                  <pic:spPr>
+                    <a:xfrm>
+                      <a:off x="0" y="0"/>
+                      <a:ext cx="5943600" cy="2561590"/>
+                    </a:xfrm>
+                    <a:prstGeom prst="rect">
+                      <a:avLst/>
+                    </a:prstGeom>
+                  </pic:spPr>
+                </pic:pic>
+              </a:graphicData>
+            </a:graphic>
+          </wp:inline>
+        </w:drawing>
+      </w:r>
+    </w:p>
+    <w:p>
+      <w:pPr>
+        <w:rPr>
+          <w:lang w:val="fr-FR"/>
+        </w:rPr>
+      </w:pPr>
+      <w:r>
+        <w:rPr>
+          <w:lang w:val="fr-FR"/>
+        </w:rPr>
+        <w:t>Cela marche bien. On essaie de piéger l’intelligence artificielle avec un nom dans le titre de la vidéo. Normalement celui-ci devrait être récupéré. Nous ne lui donnons pas d’instructions supplémentaires.</w:t>
+      </w:r>
+      <w:r>
+        <w:rPr>
+          <w:lang w:val="fr-FR"/>
+        </w:rPr>
+        <w:br/>
+      </w:r>
+      <w:r>
+        <w:rPr>
+          <w:noProof/>
+        </w:rPr>
+        <w:drawing>
+          <wp:inline distT="0" distB="0" distL="0" distR="0" wp14:anchorId="7ECC0691" wp14:editId="2D2971D3">
+            <wp:extent cx="5943600" cy="4128135"/>
+            <wp:effectExtent l="0" t="0" r="0" b="5715"/>
+            <wp:docPr id="1544743056" name="Image 1" descr="Une image contenant texte, capture d’écran, Police&#10;&#10;Description générée automatiquement"/>
+            <wp:cNvGraphicFramePr>
+              <a:graphicFrameLocks xmlns:a="http://schemas.openxmlformats.org/drawingml/2006/main" noChangeAspect="1"/>
+            </wp:cNvGraphicFramePr>
+            <a:graphic xmlns:a="http://schemas.openxmlformats.org/drawingml/2006/main">
+              <a:graphicData uri="http://schemas.openxmlformats.org/drawingml/2006/picture">
+                <pic:pic xmlns:pic="http://schemas.openxmlformats.org/drawingml/2006/picture">
+                  <pic:nvPicPr>
+                    <pic:cNvPr id="1544743056" name="Image 1" descr="Une image contenant texte, capture d’écran, Police&#10;&#10;Description générée automatiquement"/>
+                    <pic:cNvPicPr/>
+                  </pic:nvPicPr>
+                  <pic:blipFill>
+                    <a:blip r:embed="rId13"/>
+                    <a:stretch>
+                      <a:fillRect/>
+                    </a:stretch>
+                  </pic:blipFill>
+                  <pic:spPr>
+                    <a:xfrm>
+                      <a:off x="0" y="0"/>
+                      <a:ext cx="5943600" cy="4128135"/>
+                    </a:xfrm>
+                    <a:prstGeom prst="rect">
+                      <a:avLst/>
+                    </a:prstGeom>
+                  </pic:spPr>
+                </pic:pic>
+              </a:graphicData>
+            </a:graphic>
+          </wp:inline>
+        </w:drawing>
+      </w:r>
+    </w:p>
+    <w:p>
+      <w:pPr>
+        <w:rPr>
+          <w:lang w:val="fr-FR"/>
+        </w:rPr>
+      </w:pPr>
+      <w:r>
+        <w:rPr>
+          <w:lang w:val="fr-FR"/>
+        </w:rPr>
+        <w:t>Etonnamment comme dans le dataset de base, Stallone n’est pas compris comme étant un nom. Heureusement son explication nous permet de comprendre. Il a en effet compris que c’était un nom, mais puisque ce n’est pas le nom du comique, il ne l’a donc pas mis. Ce qui est vraiment bon.</w:t>
+      </w:r>
+      <w:r>
+        <w:rPr>
+          <w:lang w:val="fr-FR"/>
+        </w:rPr>
+        <w:t xml:space="preserve"> Tentons le </w:t>
+      </w:r>
+      <w:r>
+        <w:rPr>
+          <w:lang w:val="fr-FR"/>
+        </w:rPr>
+        <w:lastRenderedPageBreak/>
+        <w:t>cas sans nom :</w:t>
+      </w:r>
+      <w:r>
+        <w:rPr>
+          <w:lang w:val="fr-FR"/>
+        </w:rPr>
+        <w:br/>
+      </w:r>
+      <w:r>
+        <w:rPr>
+          <w:noProof/>
+        </w:rPr>
+        <w:drawing>
+          <wp:inline distT="0" distB="0" distL="0" distR="0" wp14:anchorId="6F6199CE" wp14:editId="14BAAFF5">
+            <wp:extent cx="5943600" cy="3108960"/>
+            <wp:effectExtent l="0" t="0" r="0" b="0"/>
+            <wp:docPr id="663215518" name="Image 1" descr="Une image contenant texte, capture d’écran, Police&#10;&#10;Description générée automatiquement"/>
+            <wp:cNvGraphicFramePr>
+              <a:graphicFrameLocks xmlns:a="http://schemas.openxmlformats.org/drawingml/2006/main" noChangeAspect="1"/>
+            </wp:cNvGraphicFramePr>
+            <a:graphic xmlns:a="http://schemas.openxmlformats.org/drawingml/2006/main">
+              <a:graphicData uri="http://schemas.openxmlformats.org/drawingml/2006/picture">
+                <pic:pic xmlns:pic="http://schemas.openxmlformats.org/drawingml/2006/picture">
+                  <pic:nvPicPr>
+                    <pic:cNvPr id="663215518" name="Image 1" descr="Une image contenant texte, capture d’écran, Police&#10;&#10;Description générée automatiquement"/>
+                    <pic:cNvPicPr/>
+                  </pic:nvPicPr>
+                  <pic:blipFill>
+                    <a:blip r:embed="rId14"/>
+                    <a:stretch>
+                      <a:fillRect/>
+                    </a:stretch>
+                  </pic:blipFill>
+                  <pic:spPr>
+                    <a:xfrm>
+                      <a:off x="0" y="0"/>
+                      <a:ext cx="5943600" cy="3108960"/>
+                    </a:xfrm>
+                    <a:prstGeom prst="rect">
+                      <a:avLst/>
+                    </a:prstGeom>
+                  </pic:spPr>
+                </pic:pic>
+              </a:graphicData>
+            </a:graphic>
+          </wp:inline>
+        </w:drawing>
+      </w:r>
+    </w:p>
+    <w:p>
+      <w:pPr>
+        <w:rPr>
+          <w:lang w:val="fr-FR"/>
+        </w:rPr>
+      </w:pPr>
+      <w:r>
+        <w:rPr>
+          <w:lang w:val="fr-FR"/>
+        </w:rPr>
+        <w:t>C’est en effet le cas pour les deux.</w:t>
+      </w:r>
+      <w:r>
+        <w:rPr>
+          <w:lang w:val="fr-FR"/>
+        </w:rPr>
+        <w:t xml:space="preserve"> Pour terminer, afin d’automatiser plus rapidement nos prompts, nous souhaitons donner plusieurs titre en une fois. Nous donnes quelques instructions pour pouvoir le </w:t>
+      </w:r>
+      <w:r>
+        <w:rPr>
+          <w:lang w:val="fr-FR"/>
+        </w:rPr>
+        <w:lastRenderedPageBreak/>
+        <w:t>« parser » aisément et on observe le résultat.</w:t>
+      </w:r>
+      <w:r>
+        <w:rPr>
+          <w:lang w:val="fr-FR"/>
+        </w:rPr>
+        <w:br/>
+      </w:r>
+      <w:r>
+        <w:rPr>
+          <w:noProof/>
+        </w:rPr>
+        <w:drawing>
+          <wp:inline distT="0" distB="0" distL="0" distR="0" wp14:anchorId="6D59BD2A" wp14:editId="7018C111">
+            <wp:extent cx="5943600" cy="4469765"/>
+            <wp:effectExtent l="0" t="0" r="0" b="6985"/>
+            <wp:docPr id="1404343046" name="Image 1" descr="Une image contenant texte, capture d’écran, Police&#10;&#10;Description générée automatiquement"/>
+            <wp:cNvGraphicFramePr>
+              <a:graphicFrameLocks xmlns:a="http://schemas.openxmlformats.org/drawingml/2006/main" noChangeAspect="1"/>
+            </wp:cNvGraphicFramePr>
+            <a:graphic xmlns:a="http://schemas.openxmlformats.org/drawingml/2006/main">
+              <a:graphicData uri="http://schemas.openxmlformats.org/drawingml/2006/picture">
+                <pic:pic xmlns:pic="http://schemas.openxmlformats.org/drawingml/2006/picture">
+                  <pic:nvPicPr>
+                    <pic:cNvPr id="1404343046" name="Image 1" descr="Une image contenant texte, capture d’écran, Police&#10;&#10;Description générée automatiquement"/>
+                    <pic:cNvPicPr/>
+                  </pic:nvPicPr>
+                  <pic:blipFill>
+                    <a:blip r:embed="rId15"/>
+                    <a:stretch>
+                      <a:fillRect/>
+                    </a:stretch>
+                  </pic:blipFill>
+                  <pic:spPr>
+                    <a:xfrm>
+                      <a:off x="0" y="0"/>
+                      <a:ext cx="5943600" cy="4469765"/>
+                    </a:xfrm>
+                    <a:prstGeom prst="rect">
+                      <a:avLst/>
+                    </a:prstGeom>
+                  </pic:spPr>
+                </pic:pic>
+              </a:graphicData>
+            </a:graphic>
+          </wp:inline>
+        </w:drawing>
+      </w:r>
+    </w:p>
+    <w:p>
+      <w:pPr>
+        <w:rPr>
+          <w:lang w:val="fr-FR"/>
+        </w:rPr>
+      </w:pPr>
+      <w:r>
+        <w:rPr>
+          <w:noProof/>
+        </w:rPr>
+        <w:drawing>
+          <wp:inline distT="0" distB="0" distL="0" distR="0" wp14:anchorId="2D9A9F3A" wp14:editId="45814023">
+            <wp:extent cx="5943600" cy="1957705"/>
+            <wp:effectExtent l="0" t="0" r="0" b="4445"/>
+            <wp:docPr id="1459504022" name="Image 1" descr="Une image contenant texte, capture d’écran, Police, algèbre&#10;&#10;Description générée automatiquement"/>
+            <wp:cNvGraphicFramePr>
+              <a:graphicFrameLocks xmlns:a="http://schemas.openxmlformats.org/drawingml/2006/main" noChangeAspect="1"/>
+            </wp:cNvGraphicFramePr>
+            <a:graphic xmlns:a="http://schemas.openxmlformats.org/drawingml/2006/main">
+              <a:graphicData uri="http://schemas.openxmlformats.org/drawingml/2006/picture">
+                <pic:pic xmlns:pic="http://schemas.openxmlformats.org/drawingml/2006/picture">
+                  <pic:nvPicPr>
+                    <pic:cNvPr id="1459504022" name="Image 1" descr="Une image contenant texte, capture d’écran, Police, algèbre&#10;&#10;Description générée automatiquement"/>
+                    <pic:cNvPicPr/>
+                  </pic:nvPicPr>
+                  <pic:blipFill>
+                    <a:blip r:embed="rId16"/>
+                    <a:stretch>
+                      <a:fillRect/>
+                    </a:stretch>
+                  </pic:blipFill>
+                  <pic:spPr>
+                    <a:xfrm>
+                      <a:off x="0" y="0"/>
+                      <a:ext cx="5943600" cy="1957705"/>
+                    </a:xfrm>
+                    <a:prstGeom prst="rect">
+                      <a:avLst/>
+                    </a:prstGeom>
+                  </pic:spPr>
+                </pic:pic>
+              </a:graphicData>
+            </a:graphic>
+          </wp:inline>
+        </w:drawing>
+      </w:r>
+    </w:p>
+    <w:p>
+      <w:pPr>
+        <w:rPr>
+          <w:lang w:val="fr-FR"/>
+        </w:rPr>
+      </w:pPr>
+      <w:r>
+        <w:rPr>
+          <w:lang w:val="fr-FR"/>
+        </w:rPr>
+        <w:lastRenderedPageBreak/>
+        <w:t>On remarque que ChatGpt a beaucoup de mal avec plusieurs instructions en même temps. Il ne retient que ce que l’on précise plus récemment. On tente de corriger ça une dernière fois :</w:t>
+      </w:r>
+      <w:r>
+        <w:rPr>
+          <w:lang w:val="fr-FR"/>
+        </w:rPr>
+        <w:br/>
+      </w:r>
+      <w:r>
+        <w:rPr>
+          <w:noProof/>
+        </w:rPr>
+        <w:drawing>
+          <wp:inline distT="0" distB="0" distL="0" distR="0" wp14:anchorId="34E6EE8B" wp14:editId="509D7B24">
+            <wp:extent cx="5943600" cy="2622550"/>
+            <wp:effectExtent l="0" t="0" r="0" b="6350"/>
+            <wp:docPr id="605517666" name="Image 1" descr="Une image contenant texte, capture d’écran, Police&#10;&#10;Description générée automatiquement"/>
+            <wp:cNvGraphicFramePr>
+              <a:graphicFrameLocks xmlns:a="http://schemas.openxmlformats.org/drawingml/2006/main" noChangeAspect="1"/>
+            </wp:cNvGraphicFramePr>
+            <a:graphic xmlns:a="http://schemas.openxmlformats.org/drawingml/2006/main">
+              <a:graphicData uri="http://schemas.openxmlformats.org/drawingml/2006/picture">
+                <pic:pic xmlns:pic="http://schemas.openxmlformats.org/drawingml/2006/picture">
+                  <pic:nvPicPr>
+                    <pic:cNvPr id="605517666" name="Image 1" descr="Une image contenant texte, capture d’écran, Police&#10;&#10;Description générée automatiquement"/>
+                    <pic:cNvPicPr/>
+                  </pic:nvPicPr>
+                  <pic:blipFill>
+                    <a:blip r:embed="rId17"/>
+                    <a:stretch>
+                      <a:fillRect/>
+                    </a:stretch>
+                  </pic:blipFill>
+                  <pic:spPr>
+                    <a:xfrm>
+                      <a:off x="0" y="0"/>
+                      <a:ext cx="5943600" cy="2622550"/>
+                    </a:xfrm>
+                    <a:prstGeom prst="rect">
+                      <a:avLst/>
+                    </a:prstGeom>
+                  </pic:spPr>
+                </pic:pic>
+              </a:graphicData>
+            </a:graphic>
+          </wp:inline>
+        </w:drawing>
+      </w:r>
+    </w:p>
+    <w:p>
+      <w:pPr>
+        <w:rPr>
+          <w:lang w:val="fr-FR"/>
+        </w:rPr>
+      </w:pPr>
+      <w:r>
+        <w:rPr>
+          <w:lang w:val="fr-FR"/>
+        </w:rPr>
+        <w:t>Malheureusement, il ne s’explique pas comme on le demandait. En revanche, nous avons nos réponses « parsables » ce qui nous permettra d’automatiser tout ça.</w:t>
       </w:r>
     </w:p>
     <w:sectPr>
@@ -820,6 +1430,29 @@
     <w:semiHidden/>
     <w:unhideWhenUsed/>
   </w:style>
+  <w:style w:type="character" w:styleId="Lienhypertexte">
+    <w:name w:val="Hyperlink"/>
+    <w:basedOn w:val="Policepardfaut"/>
+    <w:uiPriority w:val="99"/>
+    <w:unhideWhenUsed/>
+    <w:rsid w:val="00016D4E"/>
+    <w:rPr>
+      <w:color w:val="0563C1" w:themeColor="hyperlink"/>
+      <w:u w:val="single"/>
+    </w:rPr>
+  </w:style>
+  <w:style w:type="character" w:styleId="Mentionnonrsolue">
+    <w:name w:val="Unresolved Mention"/>
+    <w:basedOn w:val="Policepardfaut"/>
+    <w:uiPriority w:val="99"/>
+    <w:semiHidden/>
+    <w:unhideWhenUsed/>
+    <w:rsid w:val="00016D4E"/>
+    <w:rPr>
+      <w:color w:val="605E5C"/>
+      <w:shd w:val="clear" w:color="auto" w:fill="E1DFDD"/>
+    </w:rPr>
+  </w:style>
 </w:styles>
 </file>
 

</xml_diff>